<commit_message>
Corregir horario de operación en el informe de la marmita
Co-Authored-By: Claude Opus 5.5 <noreply@anthropic.com>
Claude-Session: https://claude.ai/code/session_01W2fxknDvfYruqkCpQ2GJn8
</commit_message>
<xml_diff>
--- a/Informe_Marmita_300L.docx
+++ b/Informe_Marmita_300L.docx
@@ -1424,7 +1424,7 @@
           <w:sz w:val="22"/>
           <w:szCs w:val="22"/>
         </w:rPr>
-        <w:t xml:space="preserve">Registro de 01:36 a 22:24. El equipo operó de 14:31 a 20:26; antes y después no hubo carga conectada.</w:t>
+        <w:t xml:space="preserve">Registro de 20 h 45 min. El equipo operó de 07:31 a 13:26; antes y después no hubo carga conectada. Las horas de este informe están corregidas: el reloj del analizador quedó desfasado 7 horas.</w:t>
       </w:r>
     </w:p>
     <w:p>
@@ -1762,7 +1762,7 @@
                 <w:sz w:val="20"/>
                 <w:szCs w:val="20"/>
               </w:rPr>
-              <w:t xml:space="preserve">14:31–14:51 y 18:41–18:56</w:t>
+              <w:t xml:space="preserve">07:31–07:51 y 11:41–11:56</w:t>
             </w:r>
           </w:p>
         </w:tc>
@@ -1880,7 +1880,7 @@
                 <w:sz w:val="20"/>
                 <w:szCs w:val="20"/>
               </w:rPr>
-              <w:t xml:space="preserve">14:56–15:51</w:t>
+              <w:t xml:space="preserve">07:56–08:51</w:t>
             </w:r>
           </w:p>
         </w:tc>
@@ -2000,7 +2000,7 @@
                 <w:sz w:val="20"/>
                 <w:szCs w:val="20"/>
               </w:rPr>
-              <w:t xml:space="preserve">16:06–16:16 y 19:06–19:11</w:t>
+              <w:t xml:space="preserve">09:06–09:16 y 12:06–12:11</w:t>
             </w:r>
           </w:p>
         </w:tc>
@@ -2120,7 +2120,7 @@
                 <w:sz w:val="20"/>
                 <w:szCs w:val="20"/>
               </w:rPr>
-              <w:t xml:space="preserve">16:31–17:36</w:t>
+              <w:t xml:space="preserve">09:31–10:36</w:t>
             </w:r>
           </w:p>
         </w:tc>
@@ -2238,7 +2238,7 @@
                 <w:sz w:val="20"/>
                 <w:szCs w:val="20"/>
               </w:rPr>
-              <w:t xml:space="preserve">20:11–20:16</w:t>
+              <w:t xml:space="preserve">13:11–13:16</w:t>
             </w:r>
           </w:p>
         </w:tc>
@@ -2496,7 +2496,7 @@
                 <w:sz w:val="20"/>
                 <w:szCs w:val="20"/>
               </w:rPr>
-              <w:t xml:space="preserve">146.9 A (16:11)</w:t>
+              <w:t xml:space="preserve">146.9 A (09:11)</w:t>
             </w:r>
           </w:p>
         </w:tc>

</xml_diff>